<commit_message>
refactor: reduzir tblBorders (bordas dos itens) de 24pt para 3pt
- Bordas das tabelas dos itens reduzidas para 3pt (minimo)
- Aplicado em AVALIACAO-02, 03, 04
- AVALIACAO-01 processada separadamente

Co-Authored-By: Claude Haiku 4.5 <noreply@anthropic.com>
</commit_message>
<xml_diff>
--- a/MATERIAIS/GESTAO_E_CONTROLE_MATERIAIS/ANALISE_DADOS_APLICADA_GESTAO/ATIVIDADES/AVALIACAO-02-CONCEITOS-FUNDAMENTOS-EXCEL.docx
+++ b/MATERIAIS/GESTAO_E_CONTROLE_MATERIAIS/ANALISE_DADOS_APLICADA_GESTAO/ATIVIDADES/AVALIACAO-02-CONCEITOS-FUNDAMENTOS-EXCEL.docx
@@ -223,12 +223,12 @@
         <w:tblLook w:firstColumn="1" w:firstRow="1" w:lastColumn="0" w:lastRow="0" w:noHBand="0" w:noVBand="1" w:val="04A0"/>
         <w:cantSplit/>
         <w:tblBorders>
-          <w:top w:val="single" w:sz="24" w:space="0" w:color="000000"/>
-          <w:left w:val="single" w:sz="24" w:space="0" w:color="000000"/>
-          <w:bottom w:val="single" w:sz="24" w:space="0" w:color="000000"/>
-          <w:right w:val="single" w:sz="24" w:space="0" w:color="000000"/>
-          <w:insideH w:val="single" w:sz="24" w:space="0" w:color="000000"/>
-          <w:insideV w:val="single" w:sz="24" w:space="0" w:color="000000"/>
+          <w:top w:val="single" w:sz="3" w:space="0" w:color="000000"/>
+          <w:left w:val="single" w:sz="3" w:space="0" w:color="000000"/>
+          <w:bottom w:val="single" w:sz="3" w:space="0" w:color="000000"/>
+          <w:right w:val="single" w:sz="3" w:space="0" w:color="000000"/>
+          <w:insideH w:val="single" w:sz="3" w:space="0" w:color="000000"/>
+          <w:insideV w:val="single" w:sz="3" w:space="0" w:color="000000"/>
         </w:tblBorders>
         <w:cantSplit w:val="1"/>
       </w:tblPr>
@@ -415,12 +415,12 @@
         <w:tblLook w:firstColumn="1" w:firstRow="1" w:lastColumn="0" w:lastRow="0" w:noHBand="0" w:noVBand="1" w:val="04A0"/>
         <w:cantSplit/>
         <w:tblBorders>
-          <w:top w:val="single" w:sz="24" w:space="0" w:color="000000"/>
-          <w:left w:val="single" w:sz="24" w:space="0" w:color="000000"/>
-          <w:bottom w:val="single" w:sz="24" w:space="0" w:color="000000"/>
-          <w:right w:val="single" w:sz="24" w:space="0" w:color="000000"/>
-          <w:insideH w:val="single" w:sz="24" w:space="0" w:color="000000"/>
-          <w:insideV w:val="single" w:sz="24" w:space="0" w:color="000000"/>
+          <w:top w:val="single" w:sz="3" w:space="0" w:color="000000"/>
+          <w:left w:val="single" w:sz="3" w:space="0" w:color="000000"/>
+          <w:bottom w:val="single" w:sz="3" w:space="0" w:color="000000"/>
+          <w:right w:val="single" w:sz="3" w:space="0" w:color="000000"/>
+          <w:insideH w:val="single" w:sz="3" w:space="0" w:color="000000"/>
+          <w:insideV w:val="single" w:sz="3" w:space="0" w:color="000000"/>
         </w:tblBorders>
         <w:cantSplit w:val="1"/>
       </w:tblPr>
@@ -607,12 +607,12 @@
         <w:tblLook w:firstColumn="1" w:firstRow="1" w:lastColumn="0" w:lastRow="0" w:noHBand="0" w:noVBand="1" w:val="04A0"/>
         <w:cantSplit/>
         <w:tblBorders>
-          <w:top w:val="single" w:sz="24" w:space="0" w:color="000000"/>
-          <w:left w:val="single" w:sz="24" w:space="0" w:color="000000"/>
-          <w:bottom w:val="single" w:sz="24" w:space="0" w:color="000000"/>
-          <w:right w:val="single" w:sz="24" w:space="0" w:color="000000"/>
-          <w:insideH w:val="single" w:sz="24" w:space="0" w:color="000000"/>
-          <w:insideV w:val="single" w:sz="24" w:space="0" w:color="000000"/>
+          <w:top w:val="single" w:sz="3" w:space="0" w:color="000000"/>
+          <w:left w:val="single" w:sz="3" w:space="0" w:color="000000"/>
+          <w:bottom w:val="single" w:sz="3" w:space="0" w:color="000000"/>
+          <w:right w:val="single" w:sz="3" w:space="0" w:color="000000"/>
+          <w:insideH w:val="single" w:sz="3" w:space="0" w:color="000000"/>
+          <w:insideV w:val="single" w:sz="3" w:space="0" w:color="000000"/>
         </w:tblBorders>
         <w:cantSplit w:val="1"/>
       </w:tblPr>
@@ -799,12 +799,12 @@
         <w:tblLook w:firstColumn="1" w:firstRow="1" w:lastColumn="0" w:lastRow="0" w:noHBand="0" w:noVBand="1" w:val="04A0"/>
         <w:cantSplit/>
         <w:tblBorders>
-          <w:top w:val="single" w:sz="24" w:space="0" w:color="000000"/>
-          <w:left w:val="single" w:sz="24" w:space="0" w:color="000000"/>
-          <w:bottom w:val="single" w:sz="24" w:space="0" w:color="000000"/>
-          <w:right w:val="single" w:sz="24" w:space="0" w:color="000000"/>
-          <w:insideH w:val="single" w:sz="24" w:space="0" w:color="000000"/>
-          <w:insideV w:val="single" w:sz="24" w:space="0" w:color="000000"/>
+          <w:top w:val="single" w:sz="3" w:space="0" w:color="000000"/>
+          <w:left w:val="single" w:sz="3" w:space="0" w:color="000000"/>
+          <w:bottom w:val="single" w:sz="3" w:space="0" w:color="000000"/>
+          <w:right w:val="single" w:sz="3" w:space="0" w:color="000000"/>
+          <w:insideH w:val="single" w:sz="3" w:space="0" w:color="000000"/>
+          <w:insideV w:val="single" w:sz="3" w:space="0" w:color="000000"/>
         </w:tblBorders>
         <w:cantSplit w:val="1"/>
       </w:tblPr>
@@ -991,12 +991,12 @@
         <w:tblLook w:firstColumn="1" w:firstRow="1" w:lastColumn="0" w:lastRow="0" w:noHBand="0" w:noVBand="1" w:val="04A0"/>
         <w:cantSplit/>
         <w:tblBorders>
-          <w:top w:val="single" w:sz="24" w:space="0" w:color="000000"/>
-          <w:left w:val="single" w:sz="24" w:space="0" w:color="000000"/>
-          <w:bottom w:val="single" w:sz="24" w:space="0" w:color="000000"/>
-          <w:right w:val="single" w:sz="24" w:space="0" w:color="000000"/>
-          <w:insideH w:val="single" w:sz="24" w:space="0" w:color="000000"/>
-          <w:insideV w:val="single" w:sz="24" w:space="0" w:color="000000"/>
+          <w:top w:val="single" w:sz="3" w:space="0" w:color="000000"/>
+          <w:left w:val="single" w:sz="3" w:space="0" w:color="000000"/>
+          <w:bottom w:val="single" w:sz="3" w:space="0" w:color="000000"/>
+          <w:right w:val="single" w:sz="3" w:space="0" w:color="000000"/>
+          <w:insideH w:val="single" w:sz="3" w:space="0" w:color="000000"/>
+          <w:insideV w:val="single" w:sz="3" w:space="0" w:color="000000"/>
         </w:tblBorders>
         <w:cantSplit w:val="1"/>
       </w:tblPr>
@@ -1183,12 +1183,12 @@
         <w:tblLook w:firstColumn="1" w:firstRow="1" w:lastColumn="0" w:lastRow="0" w:noHBand="0" w:noVBand="1" w:val="04A0"/>
         <w:cantSplit/>
         <w:tblBorders>
-          <w:top w:val="single" w:sz="24" w:space="0" w:color="000000"/>
-          <w:left w:val="single" w:sz="24" w:space="0" w:color="000000"/>
-          <w:bottom w:val="single" w:sz="24" w:space="0" w:color="000000"/>
-          <w:right w:val="single" w:sz="24" w:space="0" w:color="000000"/>
-          <w:insideH w:val="single" w:sz="24" w:space="0" w:color="000000"/>
-          <w:insideV w:val="single" w:sz="24" w:space="0" w:color="000000"/>
+          <w:top w:val="single" w:sz="3" w:space="0" w:color="000000"/>
+          <w:left w:val="single" w:sz="3" w:space="0" w:color="000000"/>
+          <w:bottom w:val="single" w:sz="3" w:space="0" w:color="000000"/>
+          <w:right w:val="single" w:sz="3" w:space="0" w:color="000000"/>
+          <w:insideH w:val="single" w:sz="3" w:space="0" w:color="000000"/>
+          <w:insideV w:val="single" w:sz="3" w:space="0" w:color="000000"/>
         </w:tblBorders>
         <w:cantSplit w:val="1"/>
       </w:tblPr>
@@ -1375,12 +1375,12 @@
         <w:tblLook w:firstColumn="1" w:firstRow="1" w:lastColumn="0" w:lastRow="0" w:noHBand="0" w:noVBand="1" w:val="04A0"/>
         <w:cantSplit/>
         <w:tblBorders>
-          <w:top w:val="single" w:sz="24" w:space="0" w:color="000000"/>
-          <w:left w:val="single" w:sz="24" w:space="0" w:color="000000"/>
-          <w:bottom w:val="single" w:sz="24" w:space="0" w:color="000000"/>
-          <w:right w:val="single" w:sz="24" w:space="0" w:color="000000"/>
-          <w:insideH w:val="single" w:sz="24" w:space="0" w:color="000000"/>
-          <w:insideV w:val="single" w:sz="24" w:space="0" w:color="000000"/>
+          <w:top w:val="single" w:sz="3" w:space="0" w:color="000000"/>
+          <w:left w:val="single" w:sz="3" w:space="0" w:color="000000"/>
+          <w:bottom w:val="single" w:sz="3" w:space="0" w:color="000000"/>
+          <w:right w:val="single" w:sz="3" w:space="0" w:color="000000"/>
+          <w:insideH w:val="single" w:sz="3" w:space="0" w:color="000000"/>
+          <w:insideV w:val="single" w:sz="3" w:space="0" w:color="000000"/>
         </w:tblBorders>
         <w:cantSplit w:val="1"/>
       </w:tblPr>
@@ -1567,12 +1567,12 @@
         <w:tblLook w:firstColumn="1" w:firstRow="1" w:lastColumn="0" w:lastRow="0" w:noHBand="0" w:noVBand="1" w:val="04A0"/>
         <w:cantSplit/>
         <w:tblBorders>
-          <w:top w:val="single" w:sz="24" w:space="0" w:color="000000"/>
-          <w:left w:val="single" w:sz="24" w:space="0" w:color="000000"/>
-          <w:bottom w:val="single" w:sz="24" w:space="0" w:color="000000"/>
-          <w:right w:val="single" w:sz="24" w:space="0" w:color="000000"/>
-          <w:insideH w:val="single" w:sz="24" w:space="0" w:color="000000"/>
-          <w:insideV w:val="single" w:sz="24" w:space="0" w:color="000000"/>
+          <w:top w:val="single" w:sz="3" w:space="0" w:color="000000"/>
+          <w:left w:val="single" w:sz="3" w:space="0" w:color="000000"/>
+          <w:bottom w:val="single" w:sz="3" w:space="0" w:color="000000"/>
+          <w:right w:val="single" w:sz="3" w:space="0" w:color="000000"/>
+          <w:insideH w:val="single" w:sz="3" w:space="0" w:color="000000"/>
+          <w:insideV w:val="single" w:sz="3" w:space="0" w:color="000000"/>
         </w:tblBorders>
         <w:cantSplit w:val="1"/>
       </w:tblPr>
@@ -1759,12 +1759,12 @@
         <w:tblLook w:firstColumn="1" w:firstRow="1" w:lastColumn="0" w:lastRow="0" w:noHBand="0" w:noVBand="1" w:val="04A0"/>
         <w:cantSplit/>
         <w:tblBorders>
-          <w:top w:val="single" w:sz="24" w:space="0" w:color="000000"/>
-          <w:left w:val="single" w:sz="24" w:space="0" w:color="000000"/>
-          <w:bottom w:val="single" w:sz="24" w:space="0" w:color="000000"/>
-          <w:right w:val="single" w:sz="24" w:space="0" w:color="000000"/>
-          <w:insideH w:val="single" w:sz="24" w:space="0" w:color="000000"/>
-          <w:insideV w:val="single" w:sz="24" w:space="0" w:color="000000"/>
+          <w:top w:val="single" w:sz="3" w:space="0" w:color="000000"/>
+          <w:left w:val="single" w:sz="3" w:space="0" w:color="000000"/>
+          <w:bottom w:val="single" w:sz="3" w:space="0" w:color="000000"/>
+          <w:right w:val="single" w:sz="3" w:space="0" w:color="000000"/>
+          <w:insideH w:val="single" w:sz="3" w:space="0" w:color="000000"/>
+          <w:insideV w:val="single" w:sz="3" w:space="0" w:color="000000"/>
         </w:tblBorders>
         <w:cantSplit w:val="1"/>
       </w:tblPr>
@@ -1951,12 +1951,12 @@
         <w:tblLook w:firstColumn="1" w:firstRow="1" w:lastColumn="0" w:lastRow="0" w:noHBand="0" w:noVBand="1" w:val="04A0"/>
         <w:cantSplit/>
         <w:tblBorders>
-          <w:top w:val="single" w:sz="24" w:space="0" w:color="000000"/>
-          <w:left w:val="single" w:sz="24" w:space="0" w:color="000000"/>
-          <w:bottom w:val="single" w:sz="24" w:space="0" w:color="000000"/>
-          <w:right w:val="single" w:sz="24" w:space="0" w:color="000000"/>
-          <w:insideH w:val="single" w:sz="24" w:space="0" w:color="000000"/>
-          <w:insideV w:val="single" w:sz="24" w:space="0" w:color="000000"/>
+          <w:top w:val="single" w:sz="3" w:space="0" w:color="000000"/>
+          <w:left w:val="single" w:sz="3" w:space="0" w:color="000000"/>
+          <w:bottom w:val="single" w:sz="3" w:space="0" w:color="000000"/>
+          <w:right w:val="single" w:sz="3" w:space="0" w:color="000000"/>
+          <w:insideH w:val="single" w:sz="3" w:space="0" w:color="000000"/>
+          <w:insideV w:val="single" w:sz="3" w:space="0" w:color="000000"/>
         </w:tblBorders>
         <w:cantSplit w:val="1"/>
       </w:tblPr>
@@ -2143,12 +2143,12 @@
         <w:tblLook w:firstColumn="1" w:firstRow="1" w:lastColumn="0" w:lastRow="0" w:noHBand="0" w:noVBand="1" w:val="04A0"/>
         <w:cantSplit/>
         <w:tblBorders>
-          <w:top w:val="single" w:sz="24" w:space="0" w:color="000000"/>
-          <w:left w:val="single" w:sz="24" w:space="0" w:color="000000"/>
-          <w:bottom w:val="single" w:sz="24" w:space="0" w:color="000000"/>
-          <w:right w:val="single" w:sz="24" w:space="0" w:color="000000"/>
-          <w:insideH w:val="single" w:sz="24" w:space="0" w:color="000000"/>
-          <w:insideV w:val="single" w:sz="24" w:space="0" w:color="000000"/>
+          <w:top w:val="single" w:sz="3" w:space="0" w:color="000000"/>
+          <w:left w:val="single" w:sz="3" w:space="0" w:color="000000"/>
+          <w:bottom w:val="single" w:sz="3" w:space="0" w:color="000000"/>
+          <w:right w:val="single" w:sz="3" w:space="0" w:color="000000"/>
+          <w:insideH w:val="single" w:sz="3" w:space="0" w:color="000000"/>
+          <w:insideV w:val="single" w:sz="3" w:space="0" w:color="000000"/>
         </w:tblBorders>
         <w:cantSplit w:val="1"/>
       </w:tblPr>
@@ -2335,12 +2335,12 @@
         <w:tblLook w:firstColumn="1" w:firstRow="1" w:lastColumn="0" w:lastRow="0" w:noHBand="0" w:noVBand="1" w:val="04A0"/>
         <w:cantSplit/>
         <w:tblBorders>
-          <w:top w:val="single" w:sz="24" w:space="0" w:color="000000"/>
-          <w:left w:val="single" w:sz="24" w:space="0" w:color="000000"/>
-          <w:bottom w:val="single" w:sz="24" w:space="0" w:color="000000"/>
-          <w:right w:val="single" w:sz="24" w:space="0" w:color="000000"/>
-          <w:insideH w:val="single" w:sz="24" w:space="0" w:color="000000"/>
-          <w:insideV w:val="single" w:sz="24" w:space="0" w:color="000000"/>
+          <w:top w:val="single" w:sz="3" w:space="0" w:color="000000"/>
+          <w:left w:val="single" w:sz="3" w:space="0" w:color="000000"/>
+          <w:bottom w:val="single" w:sz="3" w:space="0" w:color="000000"/>
+          <w:right w:val="single" w:sz="3" w:space="0" w:color="000000"/>
+          <w:insideH w:val="single" w:sz="3" w:space="0" w:color="000000"/>
+          <w:insideV w:val="single" w:sz="3" w:space="0" w:color="000000"/>
         </w:tblBorders>
         <w:cantSplit w:val="1"/>
       </w:tblPr>

</xml_diff>

<commit_message>
refactor: remover bordas internas (insideH, insideV) das avaliacoes
- Removidas linhas internas que separavam campos
- Mantidas bordas externas muito finas (3pt)
- Aplicado em AVALIACAO-02, 03, 04
- Resultado: visual mais limpo e integrado

Co-Authored-By: Claude Haiku 4.5 <noreply@anthropic.com>
</commit_message>
<xml_diff>
--- a/MATERIAIS/GESTAO_E_CONTROLE_MATERIAIS/ANALISE_DADOS_APLICADA_GESTAO/ATIVIDADES/AVALIACAO-02-CONCEITOS-FUNDAMENTOS-EXCEL.docx
+++ b/MATERIAIS/GESTAO_E_CONTROLE_MATERIAIS/ANALISE_DADOS_APLICADA_GESTAO/ATIVIDADES/AVALIACAO-02-CONCEITOS-FUNDAMENTOS-EXCEL.docx
@@ -227,8 +227,6 @@
           <w:left w:val="single" w:sz="3" w:space="0" w:color="000000"/>
           <w:bottom w:val="single" w:sz="3" w:space="0" w:color="000000"/>
           <w:right w:val="single" w:sz="3" w:space="0" w:color="000000"/>
-          <w:insideH w:val="single" w:sz="3" w:space="0" w:color="000000"/>
-          <w:insideV w:val="single" w:sz="3" w:space="0" w:color="000000"/>
         </w:tblBorders>
         <w:cantSplit w:val="1"/>
       </w:tblPr>
@@ -419,8 +417,6 @@
           <w:left w:val="single" w:sz="3" w:space="0" w:color="000000"/>
           <w:bottom w:val="single" w:sz="3" w:space="0" w:color="000000"/>
           <w:right w:val="single" w:sz="3" w:space="0" w:color="000000"/>
-          <w:insideH w:val="single" w:sz="3" w:space="0" w:color="000000"/>
-          <w:insideV w:val="single" w:sz="3" w:space="0" w:color="000000"/>
         </w:tblBorders>
         <w:cantSplit w:val="1"/>
       </w:tblPr>
@@ -611,8 +607,6 @@
           <w:left w:val="single" w:sz="3" w:space="0" w:color="000000"/>
           <w:bottom w:val="single" w:sz="3" w:space="0" w:color="000000"/>
           <w:right w:val="single" w:sz="3" w:space="0" w:color="000000"/>
-          <w:insideH w:val="single" w:sz="3" w:space="0" w:color="000000"/>
-          <w:insideV w:val="single" w:sz="3" w:space="0" w:color="000000"/>
         </w:tblBorders>
         <w:cantSplit w:val="1"/>
       </w:tblPr>
@@ -803,8 +797,6 @@
           <w:left w:val="single" w:sz="3" w:space="0" w:color="000000"/>
           <w:bottom w:val="single" w:sz="3" w:space="0" w:color="000000"/>
           <w:right w:val="single" w:sz="3" w:space="0" w:color="000000"/>
-          <w:insideH w:val="single" w:sz="3" w:space="0" w:color="000000"/>
-          <w:insideV w:val="single" w:sz="3" w:space="0" w:color="000000"/>
         </w:tblBorders>
         <w:cantSplit w:val="1"/>
       </w:tblPr>
@@ -995,8 +987,6 @@
           <w:left w:val="single" w:sz="3" w:space="0" w:color="000000"/>
           <w:bottom w:val="single" w:sz="3" w:space="0" w:color="000000"/>
           <w:right w:val="single" w:sz="3" w:space="0" w:color="000000"/>
-          <w:insideH w:val="single" w:sz="3" w:space="0" w:color="000000"/>
-          <w:insideV w:val="single" w:sz="3" w:space="0" w:color="000000"/>
         </w:tblBorders>
         <w:cantSplit w:val="1"/>
       </w:tblPr>
@@ -1187,8 +1177,6 @@
           <w:left w:val="single" w:sz="3" w:space="0" w:color="000000"/>
           <w:bottom w:val="single" w:sz="3" w:space="0" w:color="000000"/>
           <w:right w:val="single" w:sz="3" w:space="0" w:color="000000"/>
-          <w:insideH w:val="single" w:sz="3" w:space="0" w:color="000000"/>
-          <w:insideV w:val="single" w:sz="3" w:space="0" w:color="000000"/>
         </w:tblBorders>
         <w:cantSplit w:val="1"/>
       </w:tblPr>
@@ -1379,8 +1367,6 @@
           <w:left w:val="single" w:sz="3" w:space="0" w:color="000000"/>
           <w:bottom w:val="single" w:sz="3" w:space="0" w:color="000000"/>
           <w:right w:val="single" w:sz="3" w:space="0" w:color="000000"/>
-          <w:insideH w:val="single" w:sz="3" w:space="0" w:color="000000"/>
-          <w:insideV w:val="single" w:sz="3" w:space="0" w:color="000000"/>
         </w:tblBorders>
         <w:cantSplit w:val="1"/>
       </w:tblPr>
@@ -1571,8 +1557,6 @@
           <w:left w:val="single" w:sz="3" w:space="0" w:color="000000"/>
           <w:bottom w:val="single" w:sz="3" w:space="0" w:color="000000"/>
           <w:right w:val="single" w:sz="3" w:space="0" w:color="000000"/>
-          <w:insideH w:val="single" w:sz="3" w:space="0" w:color="000000"/>
-          <w:insideV w:val="single" w:sz="3" w:space="0" w:color="000000"/>
         </w:tblBorders>
         <w:cantSplit w:val="1"/>
       </w:tblPr>
@@ -1763,8 +1747,6 @@
           <w:left w:val="single" w:sz="3" w:space="0" w:color="000000"/>
           <w:bottom w:val="single" w:sz="3" w:space="0" w:color="000000"/>
           <w:right w:val="single" w:sz="3" w:space="0" w:color="000000"/>
-          <w:insideH w:val="single" w:sz="3" w:space="0" w:color="000000"/>
-          <w:insideV w:val="single" w:sz="3" w:space="0" w:color="000000"/>
         </w:tblBorders>
         <w:cantSplit w:val="1"/>
       </w:tblPr>
@@ -1955,8 +1937,6 @@
           <w:left w:val="single" w:sz="3" w:space="0" w:color="000000"/>
           <w:bottom w:val="single" w:sz="3" w:space="0" w:color="000000"/>
           <w:right w:val="single" w:sz="3" w:space="0" w:color="000000"/>
-          <w:insideH w:val="single" w:sz="3" w:space="0" w:color="000000"/>
-          <w:insideV w:val="single" w:sz="3" w:space="0" w:color="000000"/>
         </w:tblBorders>
         <w:cantSplit w:val="1"/>
       </w:tblPr>
@@ -2147,8 +2127,6 @@
           <w:left w:val="single" w:sz="3" w:space="0" w:color="000000"/>
           <w:bottom w:val="single" w:sz="3" w:space="0" w:color="000000"/>
           <w:right w:val="single" w:sz="3" w:space="0" w:color="000000"/>
-          <w:insideH w:val="single" w:sz="3" w:space="0" w:color="000000"/>
-          <w:insideV w:val="single" w:sz="3" w:space="0" w:color="000000"/>
         </w:tblBorders>
         <w:cantSplit w:val="1"/>
       </w:tblPr>
@@ -2339,8 +2317,6 @@
           <w:left w:val="single" w:sz="3" w:space="0" w:color="000000"/>
           <w:bottom w:val="single" w:sz="3" w:space="0" w:color="000000"/>
           <w:right w:val="single" w:sz="3" w:space="0" w:color="000000"/>
-          <w:insideH w:val="single" w:sz="3" w:space="0" w:color="000000"/>
-          <w:insideV w:val="single" w:sz="3" w:space="0" w:color="000000"/>
         </w:tblBorders>
         <w:cantSplit w:val="1"/>
       </w:tblPr>

</xml_diff>

<commit_message>
refactor: aplicar apenas bordas externas finas (3pt) - sem linhas internas
- Removidas todas as bordas internas (insideH, insideV)
- Mantidas apenas bordas externas muito finas (3pt)
- Resultado: layout limpo sem separacao entre campos

Scripts: apenas_bordas_externas.py, bordas_separacao_corrigidas.py
Aplicado em: AVALIACAO-02, 03, 04

Co-Authored-By: Claude Haiku 4.5 <noreply@anthropic.com>
</commit_message>
<xml_diff>
--- a/MATERIAIS/GESTAO_E_CONTROLE_MATERIAIS/ANALISE_DADOS_APLICADA_GESTAO/ATIVIDADES/AVALIACAO-02-CONCEITOS-FUNDAMENTOS-EXCEL.docx
+++ b/MATERIAIS/GESTAO_E_CONTROLE_MATERIAIS/ANALISE_DADOS_APLICADA_GESTAO/ATIVIDADES/AVALIACAO-02-CONCEITOS-FUNDAMENTOS-EXCEL.docx
@@ -7,6 +7,12 @@
         <w:tblW w:type="auto" w:w="0"/>
         <w:tblLayout w:type="fixed"/>
         <w:tblLook w:firstColumn="1" w:firstRow="1" w:lastColumn="0" w:lastRow="0" w:noHBand="0" w:noVBand="1" w:val="04A0"/>
+        <w:tblBorders>
+          <w:top w:val="single" w:sz="3" w:space="0" w:color="000000"/>
+          <w:left w:val="single" w:sz="3" w:space="0" w:color="000000"/>
+          <w:bottom w:val="single" w:sz="3" w:space="0" w:color="000000"/>
+          <w:right w:val="single" w:sz="3" w:space="0" w:color="000000"/>
+        </w:tblBorders>
       </w:tblPr>
       <w:tblGrid>
         <w:gridCol w:w="3360"/>
@@ -228,7 +234,6 @@
           <w:left w:val="single" w:sz="3" w:space="0" w:color="000000"/>
           <w:bottom w:val="single" w:sz="3" w:space="0" w:color="000000"/>
           <w:right w:val="single" w:sz="3" w:space="0" w:color="000000"/>
-          <w:insideH w:val="single" w:sz="3" w:space="0" w:color="000000"/>
         </w:tblBorders>
       </w:tblPr>
       <w:tblGrid>
@@ -419,7 +424,6 @@
           <w:left w:val="single" w:sz="3" w:space="0" w:color="000000"/>
           <w:bottom w:val="single" w:sz="3" w:space="0" w:color="000000"/>
           <w:right w:val="single" w:sz="3" w:space="0" w:color="000000"/>
-          <w:insideH w:val="single" w:sz="3" w:space="0" w:color="000000"/>
         </w:tblBorders>
       </w:tblPr>
       <w:tblGrid>
@@ -610,7 +614,6 @@
           <w:left w:val="single" w:sz="3" w:space="0" w:color="000000"/>
           <w:bottom w:val="single" w:sz="3" w:space="0" w:color="000000"/>
           <w:right w:val="single" w:sz="3" w:space="0" w:color="000000"/>
-          <w:insideH w:val="single" w:sz="3" w:space="0" w:color="000000"/>
         </w:tblBorders>
       </w:tblPr>
       <w:tblGrid>
@@ -801,7 +804,6 @@
           <w:left w:val="single" w:sz="3" w:space="0" w:color="000000"/>
           <w:bottom w:val="single" w:sz="3" w:space="0" w:color="000000"/>
           <w:right w:val="single" w:sz="3" w:space="0" w:color="000000"/>
-          <w:insideH w:val="single" w:sz="3" w:space="0" w:color="000000"/>
         </w:tblBorders>
       </w:tblPr>
       <w:tblGrid>
@@ -992,7 +994,6 @@
           <w:left w:val="single" w:sz="3" w:space="0" w:color="000000"/>
           <w:bottom w:val="single" w:sz="3" w:space="0" w:color="000000"/>
           <w:right w:val="single" w:sz="3" w:space="0" w:color="000000"/>
-          <w:insideH w:val="single" w:sz="3" w:space="0" w:color="000000"/>
         </w:tblBorders>
       </w:tblPr>
       <w:tblGrid>
@@ -1183,7 +1184,6 @@
           <w:left w:val="single" w:sz="3" w:space="0" w:color="000000"/>
           <w:bottom w:val="single" w:sz="3" w:space="0" w:color="000000"/>
           <w:right w:val="single" w:sz="3" w:space="0" w:color="000000"/>
-          <w:insideH w:val="single" w:sz="3" w:space="0" w:color="000000"/>
         </w:tblBorders>
       </w:tblPr>
       <w:tblGrid>
@@ -1374,7 +1374,6 @@
           <w:left w:val="single" w:sz="3" w:space="0" w:color="000000"/>
           <w:bottom w:val="single" w:sz="3" w:space="0" w:color="000000"/>
           <w:right w:val="single" w:sz="3" w:space="0" w:color="000000"/>
-          <w:insideH w:val="single" w:sz="3" w:space="0" w:color="000000"/>
         </w:tblBorders>
       </w:tblPr>
       <w:tblGrid>
@@ -1565,7 +1564,6 @@
           <w:left w:val="single" w:sz="3" w:space="0" w:color="000000"/>
           <w:bottom w:val="single" w:sz="3" w:space="0" w:color="000000"/>
           <w:right w:val="single" w:sz="3" w:space="0" w:color="000000"/>
-          <w:insideH w:val="single" w:sz="3" w:space="0" w:color="000000"/>
         </w:tblBorders>
       </w:tblPr>
       <w:tblGrid>
@@ -1756,7 +1754,6 @@
           <w:left w:val="single" w:sz="3" w:space="0" w:color="000000"/>
           <w:bottom w:val="single" w:sz="3" w:space="0" w:color="000000"/>
           <w:right w:val="single" w:sz="3" w:space="0" w:color="000000"/>
-          <w:insideH w:val="single" w:sz="3" w:space="0" w:color="000000"/>
         </w:tblBorders>
       </w:tblPr>
       <w:tblGrid>
@@ -1947,7 +1944,6 @@
           <w:left w:val="single" w:sz="3" w:space="0" w:color="000000"/>
           <w:bottom w:val="single" w:sz="3" w:space="0" w:color="000000"/>
           <w:right w:val="single" w:sz="3" w:space="0" w:color="000000"/>
-          <w:insideH w:val="single" w:sz="3" w:space="0" w:color="000000"/>
         </w:tblBorders>
       </w:tblPr>
       <w:tblGrid>
@@ -2138,7 +2134,6 @@
           <w:left w:val="single" w:sz="3" w:space="0" w:color="000000"/>
           <w:bottom w:val="single" w:sz="3" w:space="0" w:color="000000"/>
           <w:right w:val="single" w:sz="3" w:space="0" w:color="000000"/>
-          <w:insideH w:val="single" w:sz="3" w:space="0" w:color="000000"/>
         </w:tblBorders>
       </w:tblPr>
       <w:tblGrid>
@@ -2329,7 +2324,6 @@
           <w:left w:val="single" w:sz="3" w:space="0" w:color="000000"/>
           <w:bottom w:val="single" w:sz="3" w:space="0" w:color="000000"/>
           <w:right w:val="single" w:sz="3" w:space="0" w:color="000000"/>
-          <w:insideH w:val="single" w:sz="3" w:space="0" w:color="000000"/>
         </w:tblBorders>
       </w:tblPr>
       <w:tblGrid>

</xml_diff>

<commit_message>
refactor: adicionar linha horizontal separando CAPACIDADE (insideH)
- Bordas externas: 3pt (top, left, bottom, right)
- insideH: linha horizontal 3pt separando CAPACIDADE do Contexto
- Sem bordas verticais internas (insideV removida)
- Aplicado em todas as 4 avaliacoes

Script: bordas_com_capacidade_separada.py

Co-Authored-By: Claude Haiku 4.5 <noreply@anthropic.com>
</commit_message>
<xml_diff>
--- a/MATERIAIS/GESTAO_E_CONTROLE_MATERIAIS/ANALISE_DADOS_APLICADA_GESTAO/ATIVIDADES/AVALIACAO-02-CONCEITOS-FUNDAMENTOS-EXCEL.docx
+++ b/MATERIAIS/GESTAO_E_CONTROLE_MATERIAIS/ANALISE_DADOS_APLICADA_GESTAO/ATIVIDADES/AVALIACAO-02-CONCEITOS-FUNDAMENTOS-EXCEL.docx
@@ -234,6 +234,7 @@
           <w:left w:val="single" w:sz="3" w:space="0" w:color="000000"/>
           <w:bottom w:val="single" w:sz="3" w:space="0" w:color="000000"/>
           <w:right w:val="single" w:sz="3" w:space="0" w:color="000000"/>
+          <w:insideH w:val="single" w:sz="3" w:space="0" w:color="000000"/>
         </w:tblBorders>
       </w:tblPr>
       <w:tblGrid>
@@ -424,6 +425,7 @@
           <w:left w:val="single" w:sz="3" w:space="0" w:color="000000"/>
           <w:bottom w:val="single" w:sz="3" w:space="0" w:color="000000"/>
           <w:right w:val="single" w:sz="3" w:space="0" w:color="000000"/>
+          <w:insideH w:val="single" w:sz="3" w:space="0" w:color="000000"/>
         </w:tblBorders>
       </w:tblPr>
       <w:tblGrid>
@@ -614,6 +616,7 @@
           <w:left w:val="single" w:sz="3" w:space="0" w:color="000000"/>
           <w:bottom w:val="single" w:sz="3" w:space="0" w:color="000000"/>
           <w:right w:val="single" w:sz="3" w:space="0" w:color="000000"/>
+          <w:insideH w:val="single" w:sz="3" w:space="0" w:color="000000"/>
         </w:tblBorders>
       </w:tblPr>
       <w:tblGrid>
@@ -804,6 +807,7 @@
           <w:left w:val="single" w:sz="3" w:space="0" w:color="000000"/>
           <w:bottom w:val="single" w:sz="3" w:space="0" w:color="000000"/>
           <w:right w:val="single" w:sz="3" w:space="0" w:color="000000"/>
+          <w:insideH w:val="single" w:sz="3" w:space="0" w:color="000000"/>
         </w:tblBorders>
       </w:tblPr>
       <w:tblGrid>
@@ -994,6 +998,7 @@
           <w:left w:val="single" w:sz="3" w:space="0" w:color="000000"/>
           <w:bottom w:val="single" w:sz="3" w:space="0" w:color="000000"/>
           <w:right w:val="single" w:sz="3" w:space="0" w:color="000000"/>
+          <w:insideH w:val="single" w:sz="3" w:space="0" w:color="000000"/>
         </w:tblBorders>
       </w:tblPr>
       <w:tblGrid>
@@ -1184,6 +1189,7 @@
           <w:left w:val="single" w:sz="3" w:space="0" w:color="000000"/>
           <w:bottom w:val="single" w:sz="3" w:space="0" w:color="000000"/>
           <w:right w:val="single" w:sz="3" w:space="0" w:color="000000"/>
+          <w:insideH w:val="single" w:sz="3" w:space="0" w:color="000000"/>
         </w:tblBorders>
       </w:tblPr>
       <w:tblGrid>
@@ -1374,6 +1380,7 @@
           <w:left w:val="single" w:sz="3" w:space="0" w:color="000000"/>
           <w:bottom w:val="single" w:sz="3" w:space="0" w:color="000000"/>
           <w:right w:val="single" w:sz="3" w:space="0" w:color="000000"/>
+          <w:insideH w:val="single" w:sz="3" w:space="0" w:color="000000"/>
         </w:tblBorders>
       </w:tblPr>
       <w:tblGrid>
@@ -1564,6 +1571,7 @@
           <w:left w:val="single" w:sz="3" w:space="0" w:color="000000"/>
           <w:bottom w:val="single" w:sz="3" w:space="0" w:color="000000"/>
           <w:right w:val="single" w:sz="3" w:space="0" w:color="000000"/>
+          <w:insideH w:val="single" w:sz="3" w:space="0" w:color="000000"/>
         </w:tblBorders>
       </w:tblPr>
       <w:tblGrid>
@@ -1754,6 +1762,7 @@
           <w:left w:val="single" w:sz="3" w:space="0" w:color="000000"/>
           <w:bottom w:val="single" w:sz="3" w:space="0" w:color="000000"/>
           <w:right w:val="single" w:sz="3" w:space="0" w:color="000000"/>
+          <w:insideH w:val="single" w:sz="3" w:space="0" w:color="000000"/>
         </w:tblBorders>
       </w:tblPr>
       <w:tblGrid>
@@ -1944,6 +1953,7 @@
           <w:left w:val="single" w:sz="3" w:space="0" w:color="000000"/>
           <w:bottom w:val="single" w:sz="3" w:space="0" w:color="000000"/>
           <w:right w:val="single" w:sz="3" w:space="0" w:color="000000"/>
+          <w:insideH w:val="single" w:sz="3" w:space="0" w:color="000000"/>
         </w:tblBorders>
       </w:tblPr>
       <w:tblGrid>
@@ -2134,6 +2144,7 @@
           <w:left w:val="single" w:sz="3" w:space="0" w:color="000000"/>
           <w:bottom w:val="single" w:sz="3" w:space="0" w:color="000000"/>
           <w:right w:val="single" w:sz="3" w:space="0" w:color="000000"/>
+          <w:insideH w:val="single" w:sz="3" w:space="0" w:color="000000"/>
         </w:tblBorders>
       </w:tblPr>
       <w:tblGrid>
@@ -2324,6 +2335,7 @@
           <w:left w:val="single" w:sz="3" w:space="0" w:color="000000"/>
           <w:bottom w:val="single" w:sz="3" w:space="0" w:color="000000"/>
           <w:right w:val="single" w:sz="3" w:space="0" w:color="000000"/>
+          <w:insideH w:val="single" w:sz="3" w:space="0" w:color="000000"/>
         </w:tblBorders>
       </w:tblPr>
       <w:tblGrid>

</xml_diff>